<commit_message>
Signature : ajoute la page de garde et la page de fin à la convention
Le modèle assets/docs/lfdr-signature.docx intègre désormais la page de
garde (couverture « Convention de Conseil ») en première page et la page
de fin (coordonnées LFDR) en dernière page, encadrant la convention.

L'assemblage est fait en trois sections avec saut de page : la couverture
et la page de fin gardent leur mise en page pleine page (images de fond),
sans en-tête/pied, tandis que les pages de la convention conservent leur
en-tête (logo) et leur pied (adresse / mentions ORIAS). Les jetons de
pré-remplissage sont inchangés — le flux « Configurer » fonctionne à
l'identique sur ce modèle enrichi.

Co-Authored-By: Claude Opus 4.8 <noreply@anthropic.com>
Claude-Session: https://claude.ai/code/session_013tQ53aPFTuq57QXBddMstK
</commit_message>
<xml_diff>
--- a/assets/docs/lfdr-signature.docx
+++ b/assets/docs/lfdr-signature.docx
@@ -2,6 +2,592 @@
 <file path=word/document.xml><?xml version="1.0" encoding="utf-8"?>
 <w:document xmlns:wpc="http://schemas.microsoft.com/office/word/2010/wordprocessingCanvas" xmlns:cx="http://schemas.microsoft.com/office/drawing/2014/chartex" xmlns:cx1="http://schemas.microsoft.com/office/drawing/2015/9/8/chartex" xmlns:cx2="http://schemas.microsoft.com/office/drawing/2015/10/21/chartex" xmlns:cx3="http://schemas.microsoft.com/office/drawing/2016/5/9/chartex" xmlns:cx4="http://schemas.microsoft.com/office/drawing/2016/5/10/chartex" xmlns:cx5="http://schemas.microsoft.com/office/drawing/2016/5/11/chartex" xmlns:cx6="http://schemas.microsoft.com/office/drawing/2016/5/12/chartex" xmlns:cx7="http://schemas.microsoft.com/office/drawing/2016/5/13/chartex" xmlns:cx8="http://schemas.microsoft.com/office/drawing/2016/5/14/chartex" xmlns:mc="http://schemas.openxmlformats.org/markup-compatibility/2006" xmlns:m="http://schemas.openxmlformats.org/officeDocument/2006/math" xmlns:aink="http://schemas.microsoft.com/office/drawing/2016/ink" xmlns:am3d="http://schemas.microsoft.com/office/drawing/2017/model3d" xmlns:oel="http://schemas.microsoft.com/office/2019/extlst" xmlns:r="http://schemas.openxmlformats.org/officeDocument/2006/relationships" xmlns:wp14="http://schemas.microsoft.com/office/word/2010/wordprocessingDrawing" xmlns:wp="http://schemas.openxmlformats.org/drawingml/2006/wordprocessingDrawing" xmlns:wpg="http://schemas.microsoft.com/office/word/2010/wordprocessingGroup" xmlns:wpi="http://schemas.microsoft.com/office/word/2010/wordprocessingInk" xmlns:wps="http://schemas.microsoft.com/office/word/2010/wordprocessingShape" xmlns:o="urn:schemas-microsoft-com:office:office" xmlns:v="urn:schemas-microsoft-com:vml" xmlns:w10="urn:schemas-microsoft-com:office:word" xmlns:w="http://schemas.openxmlformats.org/wordprocessingml/2006/main" xmlns:w14="http://schemas.microsoft.com/office/word/2010/wordml" xmlns:w15="http://schemas.microsoft.com/office/word/2012/wordml" xmlns:w16cex="http://schemas.microsoft.com/office/word/2018/wordml/cex" xmlns:w16cid="http://schemas.microsoft.com/office/word/2016/wordml/cid" xmlns:w16="http://schemas.microsoft.com/office/word/2018/wordml" xmlns:w16sdtdh="http://schemas.microsoft.com/office/word/2020/wordml/sdtdatahash" xmlns:w16sdtfl="http://schemas.microsoft.com/office/word/2024/wordml/sdtformatlock" xmlns:w16se="http://schemas.microsoft.com/office/word/2015/wordml/symex" xmlns:w16du="http://schemas.microsoft.com/office/word/2023/wordml/word16du" xmlns:wne="http://schemas.microsoft.com/office/word/2006/wordml" mc:Ignorable="w14 w15 w16se w16cid w16 w16cex w16sdtdh w16sdtfl w16du wp14">
   <w:body>
+    <w:p>
+      <w:r>
+        <w:rPr>
+          <w:noProof/>
+        </w:rPr>
+        <mc:AlternateContent>
+          <mc:Choice Requires="wps">
+            <w:drawing>
+              <wp:anchor distT="0" distB="0" distL="114300" distR="114300" simplePos="0" relativeHeight="251656189" behindDoc="1" locked="0" layoutInCell="1" allowOverlap="1" wp14:anchorId="3F70B685" wp14:editId="73CF20DE">
+                <wp:simplePos x="0" y="0"/>
+                <wp:positionH relativeFrom="column">
+                  <wp:posOffset>-915293</wp:posOffset>
+                </wp:positionH>
+                <wp:positionV relativeFrom="paragraph">
+                  <wp:posOffset>-915294</wp:posOffset>
+                </wp:positionV>
+                <wp:extent cx="8229600" cy="11344759"/>
+                <wp:effectExtent l="0" t="0" r="0" b="0"/>
+                <wp:wrapNone/>
+                <wp:docPr id="34" name="Rectangle 33">
+                  <a:extLst xmlns:a="http://schemas.openxmlformats.org/drawingml/2006/main">
+                    <a:ext uri="{FF2B5EF4-FFF2-40B4-BE49-F238E27FC236}">
+                      <a16:creationId xmlns:a16="http://schemas.microsoft.com/office/drawing/2014/main" id="{765847EA-59A5-7678-ED00-35599A4B5A4D}"/>
+                    </a:ext>
+                  </a:extLst>
+                </wp:docPr>
+                <wp:cNvGraphicFramePr/>
+                <a:graphic xmlns:a="http://schemas.openxmlformats.org/drawingml/2006/main">
+                  <a:graphicData uri="http://schemas.microsoft.com/office/word/2010/wordprocessingShape">
+                    <wps:wsp>
+                      <wps:cNvSpPr/>
+                      <wps:spPr>
+                        <a:xfrm>
+                          <a:off x="0" y="0"/>
+                          <a:ext cx="8229600" cy="11344759"/>
+                        </a:xfrm>
+                        <a:prstGeom prst="rect">
+                          <a:avLst/>
+                        </a:prstGeom>
+                        <a:solidFill>
+                          <a:srgbClr val="001B00"/>
+                        </a:solidFill>
+                        <a:ln>
+                          <a:noFill/>
+                        </a:ln>
+                      </wps:spPr>
+                      <wps:style>
+                        <a:lnRef idx="2">
+                          <a:schemeClr val="accent1">
+                            <a:shade val="15000"/>
+                          </a:schemeClr>
+                        </a:lnRef>
+                        <a:fillRef idx="1">
+                          <a:schemeClr val="accent1"/>
+                        </a:fillRef>
+                        <a:effectRef idx="0">
+                          <a:schemeClr val="accent1"/>
+                        </a:effectRef>
+                        <a:fontRef idx="minor">
+                          <a:schemeClr val="lt1"/>
+                        </a:fontRef>
+                      </wps:style>
+                      <wps:bodyPr rtlCol="0" anchor="ctr"/>
+                    </wps:wsp>
+                  </a:graphicData>
+                </a:graphic>
+                <wp14:sizeRelH relativeFrom="margin">
+                  <wp14:pctWidth>0</wp14:pctWidth>
+                </wp14:sizeRelH>
+                <wp14:sizeRelV relativeFrom="margin">
+                  <wp14:pctHeight>0</wp14:pctHeight>
+                </wp14:sizeRelV>
+              </wp:anchor>
+            </w:drawing>
+          </mc:Choice>
+          <mc:Fallback>
+            <w:pict>
+              <v:rect w14:anchorId="53A45F68" id="Rectangle 33" o:spid="_x0000_s1026" style="position:absolute;margin-left:-72.05pt;margin-top:-72.05pt;width:9in;height:893.3pt;z-index:-251660291;visibility:visible;mso-wrap-style:square;mso-width-percent:0;mso-height-percent:0;mso-wrap-distance-left:9pt;mso-wrap-distance-top:0;mso-wrap-distance-right:9pt;mso-wrap-distance-bottom:0;mso-position-horizontal:absolute;mso-position-horizontal-relative:text;mso-position-vertical:absolute;mso-position-vertical-relative:text;mso-width-percent:0;mso-height-percent:0;mso-width-relative:margin;mso-height-relative:margin;v-text-anchor:middle" o:gfxdata="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" fillcolor="#001b00" stroked="f" strokeweight="1.5pt"/>
+            </w:pict>
+          </mc:Fallback>
+        </mc:AlternateContent>
+      </w:r>
+      <w:r>
+        <w:rPr>
+          <w:noProof/>
+        </w:rPr>
+        <w:drawing>
+          <wp:anchor distT="0" distB="0" distL="114300" distR="114300" simplePos="0" relativeHeight="251671551" behindDoc="0" locked="0" layoutInCell="1" allowOverlap="1" wp14:anchorId="75ED774E" wp14:editId="55BD6A6E">
+            <wp:simplePos x="0" y="0"/>
+            <wp:positionH relativeFrom="column">
+              <wp:posOffset>-1594485</wp:posOffset>
+            </wp:positionH>
+            <wp:positionV relativeFrom="paragraph">
+              <wp:posOffset>5824764</wp:posOffset>
+            </wp:positionV>
+            <wp:extent cx="10573352" cy="5286676"/>
+            <wp:effectExtent l="0" t="0" r="6350" b="0"/>
+            <wp:wrapNone/>
+            <wp:docPr id="536803045" name="Image 6"/>
+            <wp:cNvGraphicFramePr>
+              <a:graphicFrameLocks xmlns:a="http://schemas.openxmlformats.org/drawingml/2006/main" noChangeAspect="1"/>
+            </wp:cNvGraphicFramePr>
+            <a:graphic xmlns:a="http://schemas.openxmlformats.org/drawingml/2006/main">
+              <a:graphicData uri="http://schemas.openxmlformats.org/drawingml/2006/picture">
+                <pic:pic xmlns:pic="http://schemas.openxmlformats.org/drawingml/2006/picture">
+                  <pic:nvPicPr>
+                    <pic:cNvPr id="536803045" name="Image 536803045"/>
+                    <pic:cNvPicPr/>
+                  </pic:nvPicPr>
+                  <pic:blipFill>
+                    <a:blip r:embed="rId19">
+                      <a:alphaModFix amt="35000"/>
+                      <a:extLst>
+                        <a:ext uri="{28A0092B-C50C-407E-A947-70E740481C1C}">
+                          <a14:useLocalDpi xmlns:a14="http://schemas.microsoft.com/office/drawing/2010/main" val="0"/>
+                        </a:ext>
+                      </a:extLst>
+                    </a:blip>
+                    <a:stretch>
+                      <a:fillRect/>
+                    </a:stretch>
+                  </pic:blipFill>
+                  <pic:spPr>
+                    <a:xfrm>
+                      <a:off x="0" y="0"/>
+                      <a:ext cx="10573352" cy="5286676"/>
+                    </a:xfrm>
+                    <a:prstGeom prst="rect">
+                      <a:avLst/>
+                    </a:prstGeom>
+                  </pic:spPr>
+                </pic:pic>
+              </a:graphicData>
+            </a:graphic>
+            <wp14:sizeRelH relativeFrom="page">
+              <wp14:pctWidth>0</wp14:pctWidth>
+            </wp14:sizeRelH>
+            <wp14:sizeRelV relativeFrom="page">
+              <wp14:pctHeight>0</wp14:pctHeight>
+            </wp14:sizeRelV>
+          </wp:anchor>
+        </w:drawing>
+      </w:r>
+      <w:r>
+        <w:rPr>
+          <w:noProof/>
+        </w:rPr>
+        <mc:AlternateContent>
+          <mc:Choice Requires="wps">
+            <w:drawing>
+              <wp:anchor distT="0" distB="0" distL="114300" distR="114300" simplePos="0" relativeHeight="251668479" behindDoc="0" locked="0" layoutInCell="1" allowOverlap="1" wp14:anchorId="6F5B099E" wp14:editId="4FED2D8C">
+                <wp:simplePos x="0" y="0"/>
+                <wp:positionH relativeFrom="column">
+                  <wp:posOffset>-92710</wp:posOffset>
+                </wp:positionH>
+                <wp:positionV relativeFrom="paragraph">
+                  <wp:posOffset>4400550</wp:posOffset>
+                </wp:positionV>
+                <wp:extent cx="5951220" cy="566758"/>
+                <wp:effectExtent l="0" t="0" r="0" b="0"/>
+                <wp:wrapNone/>
+                <wp:docPr id="7" name="Zone de texte 1">
+                  <a:extLst xmlns:a="http://schemas.openxmlformats.org/drawingml/2006/main">
+                    <a:ext uri="{FF2B5EF4-FFF2-40B4-BE49-F238E27FC236}">
+                      <a16:creationId xmlns:a16="http://schemas.microsoft.com/office/drawing/2014/main" id="{40CB6D14-3425-383E-3FB0-E649DD95AB47}"/>
+                    </a:ext>
+                  </a:extLst>
+                </wp:docPr>
+                <wp:cNvGraphicFramePr/>
+                <a:graphic xmlns:a="http://schemas.openxmlformats.org/drawingml/2006/main">
+                  <a:graphicData uri="http://schemas.microsoft.com/office/word/2010/wordprocessingShape">
+                    <wps:wsp>
+                      <wps:cNvSpPr txBox="1"/>
+                      <wps:spPr>
+                        <a:xfrm>
+                          <a:off x="0" y="0"/>
+                          <a:ext cx="5951220" cy="566758"/>
+                        </a:xfrm>
+                        <a:prstGeom prst="rect">
+                          <a:avLst/>
+                        </a:prstGeom>
+                        <a:noFill/>
+                        <a:ln w="6350">
+                          <a:noFill/>
+                        </a:ln>
+                      </wps:spPr>
+                      <wps:txbx>
+                        <w:txbxContent>
+                          <w:p>
+                            <w:pPr>
+                              <w:spacing w:line="276" w:lineRule="auto"/>
+                              <w:jc w:val="center"/>
+                              <w:rPr>
+                                <w:rFonts w:ascii="Didot" w:eastAsia="Aptos" w:hAnsi="Didot"/>
+                                <w:b/>
+                                <w:bCs/>
+                                <w:color w:val="FEF9DF"/>
+                                <w:spacing w:val="-30"/>
+                                <w:sz w:val="56"/>
+                                <w:szCs w:val="56"/>
+                                <w14:ligatures w14:val="none"/>
+                              </w:rPr>
+                            </w:pPr>
+                            <w:r>
+                              <w:rPr>
+                                <w:rFonts w:ascii="Didot" w:eastAsia="Aptos" w:hAnsi="Didot" w:hint="cs"/>
+                                <w:b/>
+                                <w:bCs/>
+                                <w:color w:val="FEF9DF"/>
+                                <w:spacing w:val="-30"/>
+                                <w:sz w:val="56"/>
+                                <w:szCs w:val="56"/>
+                              </w:rPr>
+                              <w:t>Convention de Conseil</w:t>
+                            </w:r>
+                          </w:p>
+                        </w:txbxContent>
+                      </wps:txbx>
+                      <wps:bodyPr rot="0" spcFirstLastPara="0" vert="horz" wrap="square" lIns="91440" tIns="45720" rIns="91440" bIns="45720" numCol="1" spcCol="0" rtlCol="0" fromWordArt="0" anchor="t" anchorCtr="0" forceAA="0" compatLnSpc="1">
+                        <a:prstTxWarp prst="textNoShape">
+                          <a:avLst/>
+                        </a:prstTxWarp>
+                        <a:spAutoFit/>
+                      </wps:bodyPr>
+                    </wps:wsp>
+                  </a:graphicData>
+                </a:graphic>
+              </wp:anchor>
+            </w:drawing>
+          </mc:Choice>
+          <mc:Fallback>
+            <w:pict>
+              <v:shapetype w14:anchorId="6F5B099E" id="_x0000_t202" coordsize="21600,21600" o:spt="202" path="m,l,21600r21600,l21600,xe">
+                <v:stroke joinstyle="miter"/>
+                <v:path gradientshapeok="t" o:connecttype="rect"/>
+              </v:shapetype>
+              <v:shape id="Zone de texte 1" o:spid="_x0000_s1026" type="#_x0000_t202" style="position:absolute;margin-left:-7.3pt;margin-top:346.5pt;width:468.6pt;height:44.65pt;z-index:251668479;visibility:visible;mso-wrap-style:square;mso-wrap-distance-left:9pt;mso-wrap-distance-top:0;mso-wrap-distance-right:9pt;mso-wrap-distance-bottom:0;mso-position-horizontal:absolute;mso-position-horizontal-relative:text;mso-position-vertical:absolute;mso-position-vertical-relative:text;v-text-anchor:top" o:gfxdata="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" filled="f" stroked="f" strokeweight=".5pt">
+                <v:textbox style="mso-fit-shape-to-text:t">
+                  <w:txbxContent>
+                    <w:p>
+                      <w:pPr>
+                        <w:spacing w:line="276" w:lineRule="auto"/>
+                        <w:jc w:val="center"/>
+                        <w:rPr>
+                          <w:rFonts w:ascii="Didot" w:eastAsia="Aptos" w:hAnsi="Didot"/>
+                          <w:b/>
+                          <w:bCs/>
+                          <w:color w:val="FEF9DF"/>
+                          <w:spacing w:val="-30"/>
+                          <w:sz w:val="56"/>
+                          <w:szCs w:val="56"/>
+                          <w14:ligatures w14:val="none"/>
+                        </w:rPr>
+                      </w:pPr>
+                      <w:r>
+                        <w:rPr>
+                          <w:rFonts w:ascii="Didot" w:eastAsia="Aptos" w:hAnsi="Didot" w:hint="cs"/>
+                          <w:b/>
+                          <w:bCs/>
+                          <w:color w:val="FEF9DF"/>
+                          <w:spacing w:val="-30"/>
+                          <w:sz w:val="56"/>
+                          <w:szCs w:val="56"/>
+                        </w:rPr>
+                        <w:t>Convention de Conseil</w:t>
+                      </w:r>
+                    </w:p>
+                  </w:txbxContent>
+                </v:textbox>
+              </v:shape>
+            </w:pict>
+          </mc:Fallback>
+        </mc:AlternateContent>
+      </w:r>
+      <w:r>
+        <w:rPr>
+          <w:noProof/>
+        </w:rPr>
+        <mc:AlternateContent>
+          <mc:Choice Requires="wps">
+            <w:drawing>
+              <wp:anchor distT="0" distB="0" distL="114300" distR="114300" simplePos="0" relativeHeight="251670527" behindDoc="0" locked="0" layoutInCell="1" allowOverlap="1" wp14:anchorId="44B218F0" wp14:editId="15620E87">
+                <wp:simplePos x="0" y="0"/>
+                <wp:positionH relativeFrom="column">
+                  <wp:posOffset>1443355</wp:posOffset>
+                </wp:positionH>
+                <wp:positionV relativeFrom="paragraph">
+                  <wp:posOffset>2853711</wp:posOffset>
+                </wp:positionV>
+                <wp:extent cx="2883535" cy="469265"/>
+                <wp:effectExtent l="0" t="0" r="0" b="0"/>
+                <wp:wrapNone/>
+                <wp:docPr id="10" name="Zone de texte 1">
+                  <a:extLst xmlns:a="http://schemas.openxmlformats.org/drawingml/2006/main">
+                    <a:ext uri="{FF2B5EF4-FFF2-40B4-BE49-F238E27FC236}">
+                      <a16:creationId xmlns:a16="http://schemas.microsoft.com/office/drawing/2014/main" id="{011D16B1-E9A6-1F02-7EFA-3FC46AE352B3}"/>
+                    </a:ext>
+                  </a:extLst>
+                </wp:docPr>
+                <wp:cNvGraphicFramePr/>
+                <a:graphic xmlns:a="http://schemas.openxmlformats.org/drawingml/2006/main">
+                  <a:graphicData uri="http://schemas.microsoft.com/office/word/2010/wordprocessingShape">
+                    <wps:wsp>
+                      <wps:cNvSpPr txBox="1"/>
+                      <wps:spPr>
+                        <a:xfrm>
+                          <a:off x="0" y="0"/>
+                          <a:ext cx="2883535" cy="469265"/>
+                        </a:xfrm>
+                        <a:prstGeom prst="rect">
+                          <a:avLst/>
+                        </a:prstGeom>
+                        <a:noFill/>
+                        <a:ln w="6350">
+                          <a:noFill/>
+                        </a:ln>
+                      </wps:spPr>
+                      <wps:txbx>
+                        <w:txbxContent>
+                          <w:p>
+                            <w:pPr>
+                              <w:spacing w:line="276" w:lineRule="auto"/>
+                              <w:jc w:val="center"/>
+                              <w:rPr>
+                                <w:rFonts w:ascii="Didot" w:eastAsia="Aptos" w:hAnsi="Didot"/>
+                                <w:color w:val="FEF9DF"/>
+                                <w:spacing w:val="-26"/>
+                                <w:sz w:val="28"/>
+                                <w:szCs w:val="28"/>
+                                <w14:ligatures w14:val="none"/>
+                              </w:rPr>
+                            </w:pPr>
+                            <w:r>
+                              <w:rPr>
+                                <w:rFonts w:ascii="Didot" w:eastAsia="Aptos" w:hAnsi="Didot" w:hint="cs"/>
+                                <w:color w:val="FEF9DF"/>
+                                <w:spacing w:val="-26"/>
+                                <w:sz w:val="28"/>
+                                <w:szCs w:val="28"/>
+                              </w:rPr>
+                              <w:t xml:space="preserve">Gestion Privée </w:t>
+                            </w:r>
+                            <w:r>
+                              <w:rPr>
+                                <w:rFonts w:ascii="Didot" w:eastAsia="Aptos" w:hAnsi="Didot"/>
+                                <w:color w:val="FEF9DF"/>
+                                <w:spacing w:val="-26"/>
+                                <w:sz w:val="28"/>
+                                <w:szCs w:val="28"/>
+                              </w:rPr>
+                              <w:t xml:space="preserve">&amp; </w:t>
+                            </w:r>
+                            <w:r>
+                              <w:rPr>
+                                <w:rFonts w:ascii="Didot" w:eastAsia="Aptos" w:hAnsi="Didot" w:hint="cs"/>
+                                <w:color w:val="FEF9DF"/>
+                                <w:spacing w:val="-26"/>
+                                <w:sz w:val="28"/>
+                                <w:szCs w:val="28"/>
+                              </w:rPr>
+                              <w:t>Family Office</w:t>
+                            </w:r>
+                          </w:p>
+                        </w:txbxContent>
+                      </wps:txbx>
+                      <wps:bodyPr rot="0" spcFirstLastPara="0" vert="horz" wrap="square" lIns="91440" tIns="45720" rIns="91440" bIns="45720" numCol="1" spcCol="0" rtlCol="0" fromWordArt="0" anchor="t" anchorCtr="0" forceAA="0" compatLnSpc="1">
+                        <a:prstTxWarp prst="textNoShape">
+                          <a:avLst/>
+                        </a:prstTxWarp>
+                        <a:noAutofit/>
+                      </wps:bodyPr>
+                    </wps:wsp>
+                  </a:graphicData>
+                </a:graphic>
+              </wp:anchor>
+            </w:drawing>
+          </mc:Choice>
+          <mc:Fallback xmlns="">
+            <w:pict>
+              <v:shapetype w14:anchorId="44B218F0" id="_x0000_t202" coordsize="21600,21600" o:spt="202" path="m,l,21600r21600,l21600,xe">
+                <v:stroke joinstyle="miter"/>
+                <v:path gradientshapeok="t" o:connecttype="rect"/>
+              </v:shapetype>
+              <v:shape id="_x0000_s1027" type="#_x0000_t202" style="position:absolute;margin-left:113.65pt;margin-top:224.7pt;width:227.05pt;height:36.95pt;z-index:251670527;visibility:visible;mso-wrap-style:square;mso-wrap-distance-left:9pt;mso-wrap-distance-top:0;mso-wrap-distance-right:9pt;mso-wrap-distance-bottom:0;mso-position-horizontal:absolute;mso-position-horizontal-relative:text;mso-position-vertical:absolute;mso-position-vertical-relative:text;v-text-anchor:top" o:gfxdata="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" filled="f" stroked="f" strokeweight=".5pt">
+                <v:textbox>
+                  <w:txbxContent>
+                    <w:p>
+                      <w:pPr>
+                        <w:spacing w:line="276" w:lineRule="auto"/>
+                        <w:jc w:val="center"/>
+                        <w:rPr>
+                          <w:rFonts w:ascii="Didot" w:eastAsia="Aptos" w:hAnsi="Didot"/>
+                          <w:color w:val="FEF9DF"/>
+                          <w:spacing w:val="-26"/>
+                          <w:sz w:val="28"/>
+                          <w:szCs w:val="28"/>
+                          <w14:ligatures w14:val="none"/>
+                        </w:rPr>
+                      </w:pPr>
+                      <w:r>
+                        <w:rPr>
+                          <w:rFonts w:ascii="Didot" w:eastAsia="Aptos" w:hAnsi="Didot" w:hint="cs"/>
+                          <w:color w:val="FEF9DF"/>
+                          <w:spacing w:val="-26"/>
+                          <w:sz w:val="28"/>
+                          <w:szCs w:val="28"/>
+                        </w:rPr>
+                        <w:t xml:space="preserve">Gestion Privée </w:t>
+                      </w:r>
+                      <w:r>
+                        <w:rPr>
+                          <w:rFonts w:ascii="Didot" w:eastAsia="Aptos" w:hAnsi="Didot"/>
+                          <w:color w:val="FEF9DF"/>
+                          <w:spacing w:val="-26"/>
+                          <w:sz w:val="28"/>
+                          <w:szCs w:val="28"/>
+                        </w:rPr>
+                        <w:t xml:space="preserve">&amp; </w:t>
+                      </w:r>
+                      <w:r>
+                        <w:rPr>
+                          <w:rFonts w:ascii="Didot" w:eastAsia="Aptos" w:hAnsi="Didot" w:hint="cs"/>
+                          <w:color w:val="FEF9DF"/>
+                          <w:spacing w:val="-26"/>
+                          <w:sz w:val="28"/>
+                          <w:szCs w:val="28"/>
+                        </w:rPr>
+                        <w:t>Family Office</w:t>
+                      </w:r>
+                    </w:p>
+                  </w:txbxContent>
+                </v:textbox>
+              </v:shape>
+            </w:pict>
+          </mc:Fallback>
+        </mc:AlternateContent>
+      </w:r>
+      <w:r>
+        <w:rPr>
+          <w:noProof/>
+        </w:rPr>
+        <mc:AlternateContent>
+          <mc:Choice Requires="wps">
+            <w:drawing>
+              <wp:anchor distT="0" distB="0" distL="114300" distR="114300" simplePos="0" relativeHeight="251661311" behindDoc="0" locked="0" layoutInCell="1" allowOverlap="1" wp14:anchorId="01CE566C" wp14:editId="0C205595">
+                <wp:simplePos x="0" y="0"/>
+                <wp:positionH relativeFrom="column">
+                  <wp:posOffset>2042160</wp:posOffset>
+                </wp:positionH>
+                <wp:positionV relativeFrom="paragraph">
+                  <wp:posOffset>3859153</wp:posOffset>
+                </wp:positionV>
+                <wp:extent cx="1637030" cy="0"/>
+                <wp:effectExtent l="0" t="0" r="13970" b="12700"/>
+                <wp:wrapNone/>
+                <wp:docPr id="12" name="Shape 8">
+                  <a:extLst xmlns:a="http://schemas.openxmlformats.org/drawingml/2006/main">
+                    <a:ext uri="{FF2B5EF4-FFF2-40B4-BE49-F238E27FC236}">
+                      <a16:creationId xmlns:a16="http://schemas.microsoft.com/office/drawing/2014/main" id="{202C3E74-1A2C-EFA9-35F5-8EA4FD48DCCA}"/>
+                    </a:ext>
+                  </a:extLst>
+                </wp:docPr>
+                <wp:cNvGraphicFramePr/>
+                <a:graphic xmlns:a="http://schemas.openxmlformats.org/drawingml/2006/main">
+                  <a:graphicData uri="http://schemas.microsoft.com/office/word/2010/wordprocessingShape">
+                    <wps:wsp>
+                      <wps:cNvCnPr/>
+                      <wps:spPr>
+                        <a:xfrm>
+                          <a:off x="0" y="0"/>
+                          <a:ext cx="1637030" cy="0"/>
+                        </a:xfrm>
+                        <a:prstGeom prst="line">
+                          <a:avLst/>
+                        </a:prstGeom>
+                        <a:noFill/>
+                        <a:ln w="12700">
+                          <a:solidFill>
+                            <a:srgbClr val="A9853F"/>
+                          </a:solidFill>
+                          <a:prstDash val="solid"/>
+                        </a:ln>
+                      </wps:spPr>
+                      <wps:bodyPr/>
+                    </wps:wsp>
+                  </a:graphicData>
+                </a:graphic>
+                <wp14:sizeRelH relativeFrom="margin">
+                  <wp14:pctWidth>0</wp14:pctWidth>
+                </wp14:sizeRelH>
+              </wp:anchor>
+            </w:drawing>
+          </mc:Choice>
+          <mc:Fallback xmlns="">
+            <w:pict>
+              <v:line w14:anchorId="2768AD6B" id="Shape 8" o:spid="_x0000_s1026" style="position:absolute;z-index:251661311;visibility:visible;mso-wrap-style:square;mso-width-percent:0;mso-wrap-distance-left:9pt;mso-wrap-distance-top:0;mso-wrap-distance-right:9pt;mso-wrap-distance-bottom:0;mso-position-horizontal:absolute;mso-position-horizontal-relative:text;mso-position-vertical:absolute;mso-position-vertical-relative:text;mso-width-percent:0;mso-width-relative:margin" from="160.8pt,303.85pt" to="289.7pt,303.85pt" o:gfxdata="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" strokecolor="#a9853f" strokeweight="1pt"/>
+            </w:pict>
+          </mc:Fallback>
+        </mc:AlternateContent>
+      </w:r>
+      <w:r>
+        <w:rPr>
+          <w:noProof/>
+        </w:rPr>
+        <w:drawing>
+          <wp:anchor distT="0" distB="0" distL="114300" distR="114300" simplePos="0" relativeHeight="251665407" behindDoc="1" locked="0" layoutInCell="1" allowOverlap="1" wp14:anchorId="0B78F8AF" wp14:editId="017C1770">
+            <wp:simplePos x="0" y="0"/>
+            <wp:positionH relativeFrom="column">
+              <wp:posOffset>983576</wp:posOffset>
+            </wp:positionH>
+            <wp:positionV relativeFrom="paragraph">
+              <wp:posOffset>1275715</wp:posOffset>
+            </wp:positionV>
+            <wp:extent cx="4187727" cy="1408176"/>
+            <wp:effectExtent l="0" t="0" r="0" b="0"/>
+            <wp:wrapNone/>
+            <wp:docPr id="22" name="Image 21">
+              <a:extLst xmlns:a="http://schemas.openxmlformats.org/drawingml/2006/main">
+                <a:ext uri="{FF2B5EF4-FFF2-40B4-BE49-F238E27FC236}">
+                  <a16:creationId xmlns:a16="http://schemas.microsoft.com/office/drawing/2014/main" id="{CBBF8332-12CD-9FD5-3BC1-6A11ABF0010A}"/>
+                </a:ext>
+              </a:extLst>
+            </wp:docPr>
+            <wp:cNvGraphicFramePr>
+              <a:graphicFrameLocks xmlns:a="http://schemas.openxmlformats.org/drawingml/2006/main" noChangeAspect="1"/>
+            </wp:cNvGraphicFramePr>
+            <a:graphic xmlns:a="http://schemas.openxmlformats.org/drawingml/2006/main">
+              <a:graphicData uri="http://schemas.openxmlformats.org/drawingml/2006/picture">
+                <pic:pic xmlns:pic="http://schemas.openxmlformats.org/drawingml/2006/picture">
+                  <pic:nvPicPr>
+                    <pic:cNvPr id="22" name="Image 21">
+                      <a:extLst>
+                        <a:ext uri="{FF2B5EF4-FFF2-40B4-BE49-F238E27FC236}">
+                          <a16:creationId xmlns:a16="http://schemas.microsoft.com/office/drawing/2014/main" id="{CBBF8332-12CD-9FD5-3BC1-6A11ABF0010A}"/>
+                        </a:ext>
+                      </a:extLst>
+                    </pic:cNvPr>
+                    <pic:cNvPicPr>
+                      <a:picLocks noChangeAspect="1"/>
+                    </pic:cNvPicPr>
+                  </pic:nvPicPr>
+                  <pic:blipFill>
+                    <a:blip r:embed="rId18" cstate="print">
+                      <a:extLst>
+                        <a:ext uri="{28A0092B-C50C-407E-A947-70E740481C1C}">
+                          <a14:useLocalDpi xmlns:a14="http://schemas.microsoft.com/office/drawing/2010/main" val="0"/>
+                        </a:ext>
+                      </a:extLst>
+                    </a:blip>
+                    <a:stretch>
+                      <a:fillRect/>
+                    </a:stretch>
+                  </pic:blipFill>
+                  <pic:spPr>
+                    <a:xfrm>
+                      <a:off x="0" y="0"/>
+                      <a:ext cx="4187727" cy="1408176"/>
+                    </a:xfrm>
+                    <a:prstGeom prst="rect">
+                      <a:avLst/>
+                    </a:prstGeom>
+                  </pic:spPr>
+                </pic:pic>
+              </a:graphicData>
+            </a:graphic>
+            <wp14:sizeRelH relativeFrom="page">
+              <wp14:pctWidth>0</wp14:pctWidth>
+            </wp14:sizeRelH>
+            <wp14:sizeRelV relativeFrom="page">
+              <wp14:pctHeight>0</wp14:pctHeight>
+            </wp14:sizeRelV>
+          </wp:anchor>
+        </w:drawing>
+      </w:r>
+    </w:p>
+    <w:p>
+      <w:pPr>
+        <w:sectPr>
+          <w:type w:val="nextPage"/>
+          <w:pgSz w:w="11906" w:h="16838"/>
+          <w:pgMar w:top="1417" w:right="1417" w:bottom="1417" w:left="1417" w:header="708" w:footer="708" w:gutter="0"/>
+          <w:cols w:space="708"/>
+          <w:docGrid w:linePitch="360"/>
+        </w:sectPr>
+      </w:pPr>
+    </w:p>
     <w:p>
       <w:pPr>
         <w:pBdr>
@@ -20025,17 +20611,534 @@
         <w:spacing w:after="300" w:line="276" w:lineRule="auto"/>
       </w:pPr>
     </w:p>
+    <w:p>
+      <w:pPr>
+        <w:sectPr>
+          <w:headerReference w:type="even" r:id="rId10"/>
+          <w:headerReference w:type="default" r:id="rId11"/>
+          <w:footerReference w:type="even" r:id="rId12"/>
+          <w:footerReference w:type="default" r:id="rId13"/>
+          <w:headerReference w:type="first" r:id="rId14"/>
+          <w:footerReference w:type="first" r:id="rId15"/>
+          <w:type w:val="nextPage"/>
+          <w:pgSz w:w="11906" w:h="16838"/>
+          <w:pgMar w:top="1417" w:right="1417" w:bottom="1417" w:left="1417" w:header="708" w:footer="708" w:gutter="0"/>
+          <w:pgNumType w:start="1"/>
+          <w:cols w:space="720"/>
+        </w:sectPr>
+      </w:pPr>
+    </w:p>
+    <w:p>
+      <w:r>
+        <w:rPr>
+          <w:noProof/>
+        </w:rPr>
+        <mc:AlternateContent>
+          <mc:Choice Requires="wps">
+            <w:drawing>
+              <wp:anchor distT="0" distB="0" distL="114300" distR="114300" simplePos="0" relativeHeight="251658239" behindDoc="1" locked="0" layoutInCell="1" allowOverlap="1" wp14:anchorId="0CB0C7EB" wp14:editId="4A228C3B">
+                <wp:simplePos x="0" y="0"/>
+                <wp:positionH relativeFrom="column">
+                  <wp:posOffset>-950595</wp:posOffset>
+                </wp:positionH>
+                <wp:positionV relativeFrom="paragraph">
+                  <wp:posOffset>-1057941</wp:posOffset>
+                </wp:positionV>
+                <wp:extent cx="8781903" cy="10906125"/>
+                <wp:effectExtent l="0" t="0" r="0" b="3175"/>
+                <wp:wrapNone/>
+                <wp:docPr id="34" name="Rectangle 33">
+                  <a:extLst xmlns:a="http://schemas.openxmlformats.org/drawingml/2006/main">
+                    <a:ext uri="{FF2B5EF4-FFF2-40B4-BE49-F238E27FC236}">
+                      <a16:creationId xmlns:a16="http://schemas.microsoft.com/office/drawing/2014/main" id="{765847EA-59A5-7678-ED00-35599A4B5A4D}"/>
+                    </a:ext>
+                  </a:extLst>
+                </wp:docPr>
+                <wp:cNvGraphicFramePr/>
+                <a:graphic xmlns:a="http://schemas.openxmlformats.org/drawingml/2006/main">
+                  <a:graphicData uri="http://schemas.microsoft.com/office/word/2010/wordprocessingShape">
+                    <wps:wsp>
+                      <wps:cNvSpPr/>
+                      <wps:spPr>
+                        <a:xfrm>
+                          <a:off x="0" y="0"/>
+                          <a:ext cx="8781903" cy="10906125"/>
+                        </a:xfrm>
+                        <a:prstGeom prst="rect">
+                          <a:avLst/>
+                        </a:prstGeom>
+                        <a:solidFill>
+                          <a:srgbClr val="001B00"/>
+                        </a:solidFill>
+                        <a:ln>
+                          <a:noFill/>
+                        </a:ln>
+                      </wps:spPr>
+                      <wps:style>
+                        <a:lnRef idx="2">
+                          <a:schemeClr val="accent1">
+                            <a:shade val="15000"/>
+                          </a:schemeClr>
+                        </a:lnRef>
+                        <a:fillRef idx="1">
+                          <a:schemeClr val="accent1"/>
+                        </a:fillRef>
+                        <a:effectRef idx="0">
+                          <a:schemeClr val="accent1"/>
+                        </a:effectRef>
+                        <a:fontRef idx="minor">
+                          <a:schemeClr val="lt1"/>
+                        </a:fontRef>
+                      </wps:style>
+                      <wps:txbx>
+                        <w:txbxContent>
+                          <w:p>
+                            <w:pPr>
+                              <w:jc w:val="center"/>
+                            </w:pPr>
+                          </w:p>
+                          <w:p/>
+                          <w:p/>
+                        </w:txbxContent>
+                      </wps:txbx>
+                      <wps:bodyPr rtlCol="0" anchor="ctr"/>
+                    </wps:wsp>
+                  </a:graphicData>
+                </a:graphic>
+                <wp14:sizeRelH relativeFrom="margin">
+                  <wp14:pctWidth>0</wp14:pctWidth>
+                </wp14:sizeRelH>
+                <wp14:sizeRelV relativeFrom="margin">
+                  <wp14:pctHeight>0</wp14:pctHeight>
+                </wp14:sizeRelV>
+              </wp:anchor>
+            </w:drawing>
+          </mc:Choice>
+          <mc:Fallback>
+            <w:pict>
+              <v:rect w14:anchorId="0CB0C7EB" id="Rectangle 33" o:spid="_x0000_s1026" style="position:absolute;margin-left:-74.85pt;margin-top:-83.3pt;width:691.5pt;height:858.75pt;z-index:-251658241;visibility:visible;mso-wrap-style:square;mso-width-percent:0;mso-height-percent:0;mso-wrap-distance-left:9pt;mso-wrap-distance-top:0;mso-wrap-distance-right:9pt;mso-wrap-distance-bottom:0;mso-position-horizontal:absolute;mso-position-horizontal-relative:text;mso-position-vertical:absolute;mso-position-vertical-relative:text;mso-width-percent:0;mso-height-percent:0;mso-width-relative:margin;mso-height-relative:margin;v-text-anchor:middle" o:gfxdata="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" fillcolor="#001b00" stroked="f" strokeweight="1.5pt">
+                <v:textbox>
+                  <w:txbxContent>
+                    <w:p>
+                      <w:pPr>
+                        <w:jc w:val="center"/>
+                      </w:pPr>
+                    </w:p>
+                    <w:p/>
+                    <w:p/>
+                  </w:txbxContent>
+                </v:textbox>
+              </v:rect>
+            </w:pict>
+          </mc:Fallback>
+        </mc:AlternateContent>
+      </w:r>
+      <w:r>
+        <w:rPr>
+          <w:noProof/>
+        </w:rPr>
+        <w:drawing>
+          <wp:anchor distT="0" distB="0" distL="114300" distR="114300" simplePos="0" relativeHeight="251663360" behindDoc="0" locked="0" layoutInCell="1" allowOverlap="1" wp14:anchorId="365B440E" wp14:editId="2D0266A4">
+            <wp:simplePos x="0" y="0"/>
+            <wp:positionH relativeFrom="column">
+              <wp:posOffset>-2323465</wp:posOffset>
+            </wp:positionH>
+            <wp:positionV relativeFrom="paragraph">
+              <wp:posOffset>-3930269</wp:posOffset>
+            </wp:positionV>
+            <wp:extent cx="10573352" cy="5286676"/>
+            <wp:effectExtent l="0" t="0" r="6350" b="0"/>
+            <wp:wrapNone/>
+            <wp:docPr id="536803045" name="Image 6"/>
+            <wp:cNvGraphicFramePr>
+              <a:graphicFrameLocks xmlns:a="http://schemas.openxmlformats.org/drawingml/2006/main" noChangeAspect="1"/>
+            </wp:cNvGraphicFramePr>
+            <a:graphic xmlns:a="http://schemas.openxmlformats.org/drawingml/2006/main">
+              <a:graphicData uri="http://schemas.openxmlformats.org/drawingml/2006/picture">
+                <pic:pic xmlns:pic="http://schemas.openxmlformats.org/drawingml/2006/picture">
+                  <pic:nvPicPr>
+                    <pic:cNvPr id="536803045" name="Image 536803045"/>
+                    <pic:cNvPicPr/>
+                  </pic:nvPicPr>
+                  <pic:blipFill>
+                    <a:blip r:embed="rId21">
+                      <a:alphaModFix amt="35000"/>
+                      <a:extLst>
+                        <a:ext uri="{28A0092B-C50C-407E-A947-70E740481C1C}">
+                          <a14:useLocalDpi xmlns:a14="http://schemas.microsoft.com/office/drawing/2010/main" val="0"/>
+                        </a:ext>
+                      </a:extLst>
+                    </a:blip>
+                    <a:stretch>
+                      <a:fillRect/>
+                    </a:stretch>
+                  </pic:blipFill>
+                  <pic:spPr>
+                    <a:xfrm>
+                      <a:off x="0" y="0"/>
+                      <a:ext cx="10573352" cy="5286676"/>
+                    </a:xfrm>
+                    <a:prstGeom prst="rect">
+                      <a:avLst/>
+                    </a:prstGeom>
+                  </pic:spPr>
+                </pic:pic>
+              </a:graphicData>
+            </a:graphic>
+            <wp14:sizeRelH relativeFrom="page">
+              <wp14:pctWidth>0</wp14:pctWidth>
+            </wp14:sizeRelH>
+            <wp14:sizeRelV relativeFrom="page">
+              <wp14:pctHeight>0</wp14:pctHeight>
+            </wp14:sizeRelV>
+          </wp:anchor>
+        </w:drawing>
+      </w:r>
+    </w:p>
+    <w:p/>
+    <w:p/>
+    <w:p/>
+    <w:p/>
+    <w:p/>
+    <w:p/>
+    <w:p/>
+    <w:p>
+      <w:r>
+        <w:rPr>
+          <w:noProof/>
+        </w:rPr>
+        <w:drawing>
+          <wp:anchor distT="0" distB="0" distL="114300" distR="114300" simplePos="0" relativeHeight="251659264" behindDoc="1" locked="0" layoutInCell="1" allowOverlap="1" wp14:anchorId="4AC2347B" wp14:editId="2C18F6BC">
+            <wp:simplePos x="0" y="0"/>
+            <wp:positionH relativeFrom="column">
+              <wp:posOffset>1993788</wp:posOffset>
+            </wp:positionH>
+            <wp:positionV relativeFrom="paragraph">
+              <wp:posOffset>238760</wp:posOffset>
+            </wp:positionV>
+            <wp:extent cx="1766806" cy="594111"/>
+            <wp:effectExtent l="0" t="0" r="0" b="0"/>
+            <wp:wrapNone/>
+            <wp:docPr id="22" name="Image 21">
+              <a:extLst xmlns:a="http://schemas.openxmlformats.org/drawingml/2006/main">
+                <a:ext uri="{FF2B5EF4-FFF2-40B4-BE49-F238E27FC236}">
+                  <a16:creationId xmlns:a16="http://schemas.microsoft.com/office/drawing/2014/main" id="{CBBF8332-12CD-9FD5-3BC1-6A11ABF0010A}"/>
+                </a:ext>
+              </a:extLst>
+            </wp:docPr>
+            <wp:cNvGraphicFramePr>
+              <a:graphicFrameLocks xmlns:a="http://schemas.openxmlformats.org/drawingml/2006/main" noChangeAspect="1"/>
+            </wp:cNvGraphicFramePr>
+            <a:graphic xmlns:a="http://schemas.openxmlformats.org/drawingml/2006/main">
+              <a:graphicData uri="http://schemas.openxmlformats.org/drawingml/2006/picture">
+                <pic:pic xmlns:pic="http://schemas.openxmlformats.org/drawingml/2006/picture">
+                  <pic:nvPicPr>
+                    <pic:cNvPr id="22" name="Image 21">
+                      <a:extLst>
+                        <a:ext uri="{FF2B5EF4-FFF2-40B4-BE49-F238E27FC236}">
+                          <a16:creationId xmlns:a16="http://schemas.microsoft.com/office/drawing/2014/main" id="{CBBF8332-12CD-9FD5-3BC1-6A11ABF0010A}"/>
+                        </a:ext>
+                      </a:extLst>
+                    </pic:cNvPr>
+                    <pic:cNvPicPr>
+                      <a:picLocks noChangeAspect="1"/>
+                    </pic:cNvPicPr>
+                  </pic:nvPicPr>
+                  <pic:blipFill>
+                    <a:blip r:embed="rId20" cstate="print">
+                      <a:extLst>
+                        <a:ext uri="{28A0092B-C50C-407E-A947-70E740481C1C}">
+                          <a14:useLocalDpi xmlns:a14="http://schemas.microsoft.com/office/drawing/2010/main" val="0"/>
+                        </a:ext>
+                      </a:extLst>
+                    </a:blip>
+                    <a:stretch>
+                      <a:fillRect/>
+                    </a:stretch>
+                  </pic:blipFill>
+                  <pic:spPr>
+                    <a:xfrm>
+                      <a:off x="0" y="0"/>
+                      <a:ext cx="1766806" cy="594111"/>
+                    </a:xfrm>
+                    <a:prstGeom prst="rect">
+                      <a:avLst/>
+                    </a:prstGeom>
+                  </pic:spPr>
+                </pic:pic>
+              </a:graphicData>
+            </a:graphic>
+            <wp14:sizeRelH relativeFrom="page">
+              <wp14:pctWidth>0</wp14:pctWidth>
+            </wp14:sizeRelH>
+            <wp14:sizeRelV relativeFrom="page">
+              <wp14:pctHeight>0</wp14:pctHeight>
+            </wp14:sizeRelV>
+          </wp:anchor>
+        </w:drawing>
+      </w:r>
+    </w:p>
+    <w:p/>
+    <w:p/>
+    <w:p>
+      <w:r>
+        <w:rPr>
+          <w:noProof/>
+        </w:rPr>
+        <mc:AlternateContent>
+          <mc:Choice Requires="wps">
+            <w:drawing>
+              <wp:anchor distT="0" distB="0" distL="114300" distR="114300" simplePos="0" relativeHeight="251661312" behindDoc="0" locked="0" layoutInCell="1" allowOverlap="1" wp14:anchorId="1B602F24" wp14:editId="56825F45">
+                <wp:simplePos x="0" y="0"/>
+                <wp:positionH relativeFrom="column">
+                  <wp:posOffset>1982470</wp:posOffset>
+                </wp:positionH>
+                <wp:positionV relativeFrom="paragraph">
+                  <wp:posOffset>186335</wp:posOffset>
+                </wp:positionV>
+                <wp:extent cx="1637030" cy="0"/>
+                <wp:effectExtent l="0" t="0" r="13970" b="12700"/>
+                <wp:wrapNone/>
+                <wp:docPr id="12" name="Shape 8">
+                  <a:extLst xmlns:a="http://schemas.openxmlformats.org/drawingml/2006/main">
+                    <a:ext uri="{FF2B5EF4-FFF2-40B4-BE49-F238E27FC236}">
+                      <a16:creationId xmlns:a16="http://schemas.microsoft.com/office/drawing/2014/main" id="{202C3E74-1A2C-EFA9-35F5-8EA4FD48DCCA}"/>
+                    </a:ext>
+                  </a:extLst>
+                </wp:docPr>
+                <wp:cNvGraphicFramePr/>
+                <a:graphic xmlns:a="http://schemas.openxmlformats.org/drawingml/2006/main">
+                  <a:graphicData uri="http://schemas.microsoft.com/office/word/2010/wordprocessingShape">
+                    <wps:wsp>
+                      <wps:cNvCnPr/>
+                      <wps:spPr>
+                        <a:xfrm>
+                          <a:off x="0" y="0"/>
+                          <a:ext cx="1637030" cy="0"/>
+                        </a:xfrm>
+                        <a:prstGeom prst="line">
+                          <a:avLst/>
+                        </a:prstGeom>
+                        <a:noFill/>
+                        <a:ln w="12700">
+                          <a:solidFill>
+                            <a:srgbClr val="A9853F"/>
+                          </a:solidFill>
+                          <a:prstDash val="solid"/>
+                        </a:ln>
+                      </wps:spPr>
+                      <wps:bodyPr/>
+                    </wps:wsp>
+                  </a:graphicData>
+                </a:graphic>
+                <wp14:sizeRelH relativeFrom="margin">
+                  <wp14:pctWidth>0</wp14:pctWidth>
+                </wp14:sizeRelH>
+              </wp:anchor>
+            </w:drawing>
+          </mc:Choice>
+          <mc:Fallback>
+            <w:pict>
+              <v:line w14:anchorId="0C96FB1E" id="Shape 8" o:spid="_x0000_s1026" style="position:absolute;z-index:251661312;visibility:visible;mso-wrap-style:square;mso-width-percent:0;mso-wrap-distance-left:9pt;mso-wrap-distance-top:0;mso-wrap-distance-right:9pt;mso-wrap-distance-bottom:0;mso-position-horizontal:absolute;mso-position-horizontal-relative:text;mso-position-vertical:absolute;mso-position-vertical-relative:text;mso-width-percent:0;mso-width-relative:margin" from="156.1pt,14.65pt" to="285pt,14.65pt" o:gfxdata="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" strokecolor="#a9853f" strokeweight="1pt"/>
+            </w:pict>
+          </mc:Fallback>
+        </mc:AlternateContent>
+      </w:r>
+    </w:p>
+    <w:p>
+      <w:pPr>
+        <w:jc w:val="center"/>
+      </w:pPr>
+    </w:p>
+    <w:p>
+      <w:pPr>
+        <w:jc w:val="center"/>
+        <w:rPr>
+          <w:rFonts w:ascii="Jost Light" w:hAnsi="Jost Light"/>
+          <w:color w:val="FFFFFF" w:themeColor="background1"/>
+          <w:sz w:val="20"/>
+          <w:szCs w:val="20"/>
+        </w:rPr>
+      </w:pPr>
+      <w:r>
+        <w:rPr>
+          <w:rFonts w:ascii="Jost Light" w:hAnsi="Jost Light"/>
+          <w:color w:val="FFFFFF" w:themeColor="background1"/>
+          <w:sz w:val="20"/>
+          <w:szCs w:val="20"/>
+        </w:rPr>
+        <w:t>lafinancierederochechouart.com</w:t>
+      </w:r>
+    </w:p>
+    <w:p>
+      <w:pPr>
+        <w:jc w:val="center"/>
+        <w:rPr>
+          <w:rFonts w:ascii="Jost Light" w:hAnsi="Jost Light"/>
+          <w:color w:val="FFFFFF" w:themeColor="background1"/>
+          <w:sz w:val="20"/>
+          <w:szCs w:val="20"/>
+        </w:rPr>
+      </w:pPr>
+      <w:r>
+        <w:rPr>
+          <w:rFonts w:ascii="Jost Light" w:hAnsi="Jost Light"/>
+          <w:color w:val="FFFFFF" w:themeColor="background1"/>
+          <w:sz w:val="20"/>
+          <w:szCs w:val="20"/>
+        </w:rPr>
+        <w:t>58 rue de Monceau,</w:t>
+      </w:r>
+    </w:p>
+    <w:p>
+      <w:pPr>
+        <w:jc w:val="center"/>
+        <w:rPr>
+          <w:rFonts w:ascii="Jost Light" w:hAnsi="Jost Light"/>
+          <w:color w:val="FFFFFF" w:themeColor="background1"/>
+          <w:sz w:val="20"/>
+          <w:szCs w:val="20"/>
+        </w:rPr>
+      </w:pPr>
+      <w:r>
+        <w:rPr>
+          <w:rFonts w:ascii="Jost Light" w:hAnsi="Jost Light"/>
+          <w:color w:val="FFFFFF" w:themeColor="background1"/>
+          <w:sz w:val="20"/>
+          <w:szCs w:val="20"/>
+        </w:rPr>
+        <w:t>75008 Paris</w:t>
+      </w:r>
+    </w:p>
+    <w:p>
+      <w:pPr>
+        <w:rPr>
+          <w:rFonts w:ascii="Jost Light" w:hAnsi="Jost Light"/>
+          <w:sz w:val="20"/>
+          <w:szCs w:val="20"/>
+        </w:rPr>
+      </w:pPr>
+    </w:p>
+    <w:p>
+      <w:pPr>
+        <w:rPr>
+          <w:rFonts w:ascii="Jost Light" w:hAnsi="Jost Light"/>
+          <w:sz w:val="20"/>
+          <w:szCs w:val="20"/>
+        </w:rPr>
+      </w:pPr>
+    </w:p>
+    <w:p>
+      <w:pPr>
+        <w:rPr>
+          <w:rFonts w:ascii="Jost Light" w:hAnsi="Jost Light"/>
+          <w:sz w:val="20"/>
+          <w:szCs w:val="20"/>
+        </w:rPr>
+      </w:pPr>
+    </w:p>
+    <w:p>
+      <w:pPr>
+        <w:rPr>
+          <w:rFonts w:ascii="Jost Light" w:hAnsi="Jost Light"/>
+          <w:sz w:val="20"/>
+          <w:szCs w:val="20"/>
+        </w:rPr>
+      </w:pPr>
+    </w:p>
+    <w:p>
+      <w:pPr>
+        <w:jc w:val="center"/>
+        <w:rPr>
+          <w:rFonts w:ascii="Jost Light" w:hAnsi="Jost Light"/>
+          <w:sz w:val="20"/>
+          <w:szCs w:val="20"/>
+        </w:rPr>
+      </w:pPr>
+    </w:p>
+    <w:p>
+      <w:pPr>
+        <w:rPr>
+          <w:rFonts w:ascii="Jost Light" w:hAnsi="Jost Light"/>
+          <w:sz w:val="20"/>
+          <w:szCs w:val="20"/>
+        </w:rPr>
+      </w:pPr>
+    </w:p>
+    <w:p>
+      <w:pPr>
+        <w:rPr>
+          <w:rFonts w:ascii="Jost Light" w:hAnsi="Jost Light"/>
+          <w:sz w:val="20"/>
+          <w:szCs w:val="20"/>
+        </w:rPr>
+      </w:pPr>
+    </w:p>
+    <w:p>
+      <w:pPr>
+        <w:rPr>
+          <w:rFonts w:ascii="Jost Light" w:hAnsi="Jost Light"/>
+          <w:sz w:val="20"/>
+          <w:szCs w:val="20"/>
+        </w:rPr>
+      </w:pPr>
+    </w:p>
+    <w:p>
+      <w:pPr>
+        <w:rPr>
+          <w:rFonts w:ascii="Jost Light" w:hAnsi="Jost Light"/>
+          <w:color w:val="000000" w:themeColor="text1"/>
+          <w:sz w:val="20"/>
+          <w:szCs w:val="20"/>
+        </w:rPr>
+      </w:pPr>
+    </w:p>
+    <w:p>
+      <w:pPr>
+        <w:rPr>
+          <w:rFonts w:ascii="Jost Light" w:hAnsi="Jost Light"/>
+          <w:color w:val="000000" w:themeColor="text1"/>
+          <w:sz w:val="20"/>
+          <w:szCs w:val="20"/>
+        </w:rPr>
+      </w:pPr>
+    </w:p>
+    <w:p>
+      <w:pPr>
+        <w:rPr>
+          <w:rFonts w:ascii="Jost Light" w:hAnsi="Jost Light"/>
+          <w:color w:val="000000" w:themeColor="text1"/>
+          <w:sz w:val="20"/>
+          <w:szCs w:val="20"/>
+        </w:rPr>
+      </w:pPr>
+    </w:p>
+    <w:p>
+      <w:pPr>
+        <w:tabs>
+          <w:tab w:val="left" w:pos="2758"/>
+        </w:tabs>
+        <w:jc w:val="center"/>
+        <w:rPr>
+          <w:rFonts w:ascii="Jost" w:hAnsi="Jost" w:cs="Cormorant Garamond"/>
+          <w:color w:val="FDF9F2"/>
+        </w:rPr>
+      </w:pPr>
+      <w:r>
+        <w:rPr>
+          <w:rFonts w:ascii="Jost" w:hAnsi="Jost" w:cs="Cormorant Garamond"/>
+          <w:color w:val="FDF9F2"/>
+        </w:rPr>
+        <w:t>Gestion Privée – Family Office – Placement de trésorerie</w:t>
+      </w:r>
+    </w:p>
     <w:sectPr>
-      <w:headerReference w:type="even" r:id="rId10"/>
-      <w:headerReference w:type="default" r:id="rId11"/>
-      <w:footerReference w:type="even" r:id="rId12"/>
-      <w:footerReference w:type="default" r:id="rId13"/>
-      <w:headerReference w:type="first" r:id="rId14"/>
-      <w:footerReference w:type="first" r:id="rId15"/>
+      <w:headerReference w:type="default" r:id="rId22"/>
+      <w:footerReference w:type="default" r:id="rId23"/>
       <w:pgSz w:w="11906" w:h="16838"/>
       <w:pgMar w:top="1417" w:right="1417" w:bottom="1417" w:left="1417" w:header="708" w:footer="708" w:gutter="0"/>
-      <w:pgNumType w:start="1"/>
-      <w:cols w:space="720"/>
+      <w:cols w:space="708"/>
+      <w:docGrid w:linePitch="360"/>
     </w:sectPr>
   </w:body>
 </w:document>
@@ -20178,6 +21281,16 @@
 </w:ftr>
 </file>
 
+<file path=word/footerBlank.xml><?xml version="1.0" encoding="utf-8"?>
+<w:ftr xmlns:w="http://schemas.openxmlformats.org/wordprocessingml/2006/main">
+  <w:p>
+    <w:pPr>
+      <w:pStyle w:val="Pieddepage"/>
+    </w:pPr>
+  </w:p>
+</w:ftr>
+</file>
+
 <file path=word/footnotes.xml><?xml version="1.0" encoding="utf-8"?>
 <w:footnotes xmlns:wpc="http://schemas.microsoft.com/office/word/2010/wordprocessingCanvas" xmlns:cx="http://schemas.microsoft.com/office/drawing/2014/chartex" xmlns:cx1="http://schemas.microsoft.com/office/drawing/2015/9/8/chartex" xmlns:cx2="http://schemas.microsoft.com/office/drawing/2015/10/21/chartex" xmlns:cx3="http://schemas.microsoft.com/office/drawing/2016/5/9/chartex" xmlns:cx4="http://schemas.microsoft.com/office/drawing/2016/5/10/chartex" xmlns:cx5="http://schemas.microsoft.com/office/drawing/2016/5/11/chartex" xmlns:cx6="http://schemas.microsoft.com/office/drawing/2016/5/12/chartex" xmlns:cx7="http://schemas.microsoft.com/office/drawing/2016/5/13/chartex" xmlns:cx8="http://schemas.microsoft.com/office/drawing/2016/5/14/chartex" xmlns:mc="http://schemas.openxmlformats.org/markup-compatibility/2006" xmlns:m="http://schemas.openxmlformats.org/officeDocument/2006/math" xmlns:aink="http://schemas.microsoft.com/office/drawing/2016/ink" xmlns:am3d="http://schemas.microsoft.com/office/drawing/2017/model3d" xmlns:oel="http://schemas.microsoft.com/office/2019/extlst" xmlns:r="http://schemas.openxmlformats.org/officeDocument/2006/relationships" xmlns:wp14="http://schemas.microsoft.com/office/word/2010/wordprocessingDrawing" xmlns:wp="http://schemas.openxmlformats.org/drawingml/2006/wordprocessingDrawing" xmlns:wpg="http://schemas.microsoft.com/office/word/2010/wordprocessingGroup" xmlns:wpi="http://schemas.microsoft.com/office/word/2010/wordprocessingInk" xmlns:wps="http://schemas.microsoft.com/office/word/2010/wordprocessingShape" xmlns:o="urn:schemas-microsoft-com:office:office" xmlns:v="urn:schemas-microsoft-com:vml" xmlns:w10="urn:schemas-microsoft-com:office:word" xmlns:w="http://schemas.openxmlformats.org/wordprocessingml/2006/main" xmlns:w14="http://schemas.microsoft.com/office/word/2010/wordml" xmlns:w15="http://schemas.microsoft.com/office/word/2012/wordml" xmlns:w16cex="http://schemas.microsoft.com/office/word/2018/wordml/cex" xmlns:w16cid="http://schemas.microsoft.com/office/word/2016/wordml/cid" xmlns:w16="http://schemas.microsoft.com/office/word/2018/wordml" xmlns:w16sdtdh="http://schemas.microsoft.com/office/word/2020/wordml/sdtdatahash" xmlns:w16sdtfl="http://schemas.microsoft.com/office/word/2024/wordml/sdtformatlock" xmlns:w16se="http://schemas.microsoft.com/office/word/2015/wordml/symex" xmlns:w16du="http://schemas.microsoft.com/office/word/2023/wordml/word16du" xmlns:wne="http://schemas.microsoft.com/office/word/2006/wordml" mc:Ignorable="w14 w15 w16se w16cid w16 w16cex w16sdtdh w16sdtfl w16du wp14">
   <w:footnote w:type="separator" w:id="-1">
@@ -20281,6 +21394,16 @@
 
 <file path=word/header3.xml><?xml version="1.0" encoding="utf-8"?>
 <w:hdr xmlns:wpc="http://schemas.microsoft.com/office/word/2010/wordprocessingCanvas" xmlns:cx="http://schemas.microsoft.com/office/drawing/2014/chartex" xmlns:cx1="http://schemas.microsoft.com/office/drawing/2015/9/8/chartex" xmlns:cx2="http://schemas.microsoft.com/office/drawing/2015/10/21/chartex" xmlns:cx3="http://schemas.microsoft.com/office/drawing/2016/5/9/chartex" xmlns:cx4="http://schemas.microsoft.com/office/drawing/2016/5/10/chartex" xmlns:cx5="http://schemas.microsoft.com/office/drawing/2016/5/11/chartex" xmlns:cx6="http://schemas.microsoft.com/office/drawing/2016/5/12/chartex" xmlns:cx7="http://schemas.microsoft.com/office/drawing/2016/5/13/chartex" xmlns:cx8="http://schemas.microsoft.com/office/drawing/2016/5/14/chartex" xmlns:mc="http://schemas.openxmlformats.org/markup-compatibility/2006" xmlns:m="http://schemas.openxmlformats.org/officeDocument/2006/math" xmlns:aink="http://schemas.microsoft.com/office/drawing/2016/ink" xmlns:am3d="http://schemas.microsoft.com/office/drawing/2017/model3d" xmlns:oel="http://schemas.microsoft.com/office/2019/extlst" xmlns:r="http://schemas.openxmlformats.org/officeDocument/2006/relationships" xmlns:wp14="http://schemas.microsoft.com/office/word/2010/wordprocessingDrawing" xmlns:wp="http://schemas.openxmlformats.org/drawingml/2006/wordprocessingDrawing" xmlns:wpg="http://schemas.microsoft.com/office/word/2010/wordprocessingGroup" xmlns:wpi="http://schemas.microsoft.com/office/word/2010/wordprocessingInk" xmlns:wps="http://schemas.microsoft.com/office/word/2010/wordprocessingShape" xmlns:o="urn:schemas-microsoft-com:office:office" xmlns:v="urn:schemas-microsoft-com:vml" xmlns:w10="urn:schemas-microsoft-com:office:word" xmlns:w="http://schemas.openxmlformats.org/wordprocessingml/2006/main" xmlns:w14="http://schemas.microsoft.com/office/word/2010/wordml" xmlns:w15="http://schemas.microsoft.com/office/word/2012/wordml" xmlns:w16cex="http://schemas.microsoft.com/office/word/2018/wordml/cex" xmlns:w16cid="http://schemas.microsoft.com/office/word/2016/wordml/cid" xmlns:w16="http://schemas.microsoft.com/office/word/2018/wordml" xmlns:w16sdtdh="http://schemas.microsoft.com/office/word/2020/wordml/sdtdatahash" xmlns:w16sdtfl="http://schemas.microsoft.com/office/word/2024/wordml/sdtformatlock" xmlns:w16se="http://schemas.microsoft.com/office/word/2015/wordml/symex" xmlns:w16du="http://schemas.microsoft.com/office/word/2023/wordml/word16du" xmlns:wne="http://schemas.microsoft.com/office/word/2006/wordml" mc:Ignorable="w14 w15 w16se w16cid w16 w16cex w16sdtdh w16sdtfl w16du wp14">
+  <w:p>
+    <w:pPr>
+      <w:pStyle w:val="En-tte"/>
+    </w:pPr>
+  </w:p>
+</w:hdr>
+</file>
+
+<file path=word/headerBlank.xml><?xml version="1.0" encoding="utf-8"?>
+<w:hdr xmlns:w="http://schemas.openxmlformats.org/wordprocessingml/2006/main">
   <w:p>
     <w:pPr>
       <w:pStyle w:val="En-tte"/>

</xml_diff>